<commit_message>
docs: refresh final report (86 tests, evaluate 268) and interactive demo walkthrough
Co-Authored-By: Claude Fable 5 <noreply@anthropic.com>
</commit_message>
<xml_diff>
--- a/docs/submission/2026_오픈소스개발자대회_결과보고서_CivicProof_최종.docx
+++ b/docs/submission/2026_오픈소스개발자대회_결과보고서_CivicProof_최종.docx
@@ -1304,7 +1304,7 @@
                 <w:color w:val="000000"/>
                 <w:sz w:val="20"/>
               </w:rPr>
-              <w:t>자동 테스트 75개 전부 통과(Vitest 55 + Hardhat 20) · 레드팀 공격 12종 중 12종 차단 · 감사 리플레이 MATCH · 시민 무결성 지수 100/100 EXCELLENT · npm audit 취약점 0건 · 자체 평가 하네스 242점(통과 기준 110점).</w:t>
+              <w:t>자동 테스트 86개 전부 통과(Vitest 66 + Hardhat 20) · 레드팀 공격 12종 중 12종 차단(Node·브라우저 이중) · 감사 리플레이 MATCH · 시민 무결성 지수 100/100 EXCELLENT · npm audit 취약점 0건 · 자체 평가 하네스 268점(통과 기준 110점).</w:t>
             </w:r>
           </w:p>
         </w:tc>
@@ -1645,7 +1645,7 @@
                 <w:color w:val="000000"/>
                 <w:sz w:val="20"/>
               </w:rPr>
-              <w:t>⑤ CI/하네스 계층 — GitHub Actions 8게이트와 Python 평가 하네스(242/110)가 문서의 모든 주장과 코드 상태의 불일치를 자동 탐지한다.</w:t>
+              <w:t>⑤ CI/하네스 계층 — GitHub Actions 8게이트와 Python 평가 하네스(268/110)가 문서의 모든 주장과 코드 상태의 불일치를 자동 탐지한다.</w:t>
             </w:r>
           </w:p>
           <w:p>
@@ -1958,7 +1958,7 @@
                 <w:color w:val="000000"/>
                 <w:sz w:val="20"/>
               </w:rPr>
-              <w:t>① 수직 슬라이스 우선: 널리파이어→VC→레지스트리→웹까지 항상 연결된 상태 유지 ② 테스트 게이트: 기능마다 테스트 작성→통과 전 병합 금지(29→75개) ③ 브랜치 규율: feature/integrity-engine → PR #1(develop, CI 그린 후 머지) → PR #2(main 릴리스) ④ 보안 보완 이력: 무허가 등록 리스크→발급자 RBAC 도입, innerHTML→textContent 전환, Pages에서 서명 모듈 404 결함 발견→저장소 번들로 교정(라이브 데모 정상화).</w:t>
+              <w:t>① 수직 슬라이스 우선: 널리파이어→VC→레지스트리→웹까지 항상 연결된 상태 유지 ② 테스트 게이트: 기능마다 테스트 작성→통과 전 병합 금지(29→86개) ③ 브랜치 규율: feature/* → PR(develop, CI 그린 후 머지) → main 릴리스, 5개 PR 순차 검증 ④ 보안 보완 이력: 무허가 등록 리스크→발급자 RBAC 도입, 마크업 싱크 배제(createElement·textContent), Pages 서명 모듈 404 결함 발견→저장소 번들로 교정(라이브 데모 정상화).</w:t>
             </w:r>
           </w:p>
           <w:p>
@@ -1986,35 +1986,21 @@
                 <w:color w:val="000000"/>
                 <w:sz w:val="20"/>
               </w:rPr>
-              <w:t>npm ci → npm test(55 passed) → npm run build(타입 무결성) → npm run test:contracts(20 passing) → npm run demo(정상 2건 수리·중복 1건 차단·PII 0필드·Replay MATCH·CII 100/100) → npm run redteam(Blocked 12/12) → npm run deploy:local(로컬 EVM 배포) → npm run evaluate(242/110) → npm audit(0 vulnerabilities). 모든 명령은 외부 API·키 없이 오프라인 재현된다.</w:t>
-            </w:r>
-          </w:p>
-          <w:p>
-            <w:pPr>
-              <w:spacing w:before="20" w:after="20" w:line="240" w:lineRule="auto"/>
-            </w:pPr>
-            <w:r>
-              <w:rPr>
-                <w:rFonts w:ascii="맑은 고딕" w:hAnsi="맑은 고딕" w:eastAsia="맑은 고딕"/>
-                <w:b w:val="0"/>
-                <w:color w:val="000000"/>
-                <w:sz w:val="20"/>
-              </w:rPr>
-              <w:t>웹 시연: https://leeminsuk.github.io/civicproof-ledger/ 접속 → 데모 VC 로드 → 서명 검증(NORMAL) → 필드 1글자 변조 시 TAMPERED → 같은 VC 재검증 시 DUPLICATE → 공개 감사 패널에서 무결성 지수 100/100과 “Replay verification MATCH”를 확인. 시연영상은 동일 흐름을 3분 내로 담는다.</w:t>
-            </w:r>
-          </w:p>
-          <w:p>
-            <w:pPr>
-              <w:spacing w:before="20" w:after="20" w:line="240" w:lineRule="auto"/>
-            </w:pPr>
-            <w:r>
-              <w:rPr>
-                <w:rFonts w:ascii="맑은 고딕" w:hAnsi="맑은 고딕" w:eastAsia="맑은 고딕"/>
-                <w:b w:val="0"/>
-                <w:color w:val="000000"/>
-                <w:sz w:val="20"/>
-              </w:rPr>
-              <w:t>심사 검증 포인트 매핑 — “중복이 정말 막히나” → npm run demo의 DuplicateDetected 이벤트와 원본 클레임 불변 확인 / “개인정보가 정말 없나” → 공개 상태 전 필드 열람(PII 0) 및 교차 추적 차단(ATK-07) / “위변조에 견디나” → npm run redteam 12종 결과표 / “장부를 조작하면” → 리플레이 검증 divergence 코드 출력 / “문서 주장이 과장 아닌가” → npm run evaluate가 문서·코드 불일치를 항목별 채점.</w:t>
+              <w:t>npm ci → npm test(66 passed) → npm run build(타입 무결성) → npm run test:contracts(20 passing) → npm run demo(정상 2건 수리·중복 1건 차단·PII 0필드·Replay MATCH·CII 100/100) → npm run redteam(Blocked 12/12) → npm run deploy:local(로컬 EVM 배포) → npm run evaluate(268/110) → npm audit(0 vulnerabilities). 모든 명령은 외부 API·키 없이 오프라인 재현된다.</w:t>
+            </w:r>
+          </w:p>
+          <w:p>
+            <w:pPr>
+              <w:spacing w:before="20" w:after="20" w:line="240" w:lineRule="auto"/>
+            </w:pPr>
+            <w:r>
+              <w:rPr>
+                <w:rFonts w:ascii="맑은 고딕" w:hAnsi="맑은 고딕" w:eastAsia="맑은 고딕"/>
+                <w:b w:val="0"/>
+                <w:color w:val="000000"/>
+                <w:sz w:val="20"/>
+              </w:rPr>
+              <w:t>웹 시연(4막 인터랙티브 대시보드, https://leeminsuk.github.io/civicproof-ledger/): ① 히어로 — 개인정보가 해시 방벽을 지나 널리파이어로 바뀌는 애니메이션과 ‘온체인 개인정보 0필드’ KPI ② 원장 시뮬레이터 — [시나리오 자동 재생]으로 같은 사업 재신청은 중복 차단, 다른 사업은 널리파이어가 달라 교차추적 불가임을 눈으로 확인 ③ 공격 극장 — [공격 12종 실행]으로 레드팀 ATK-01~12를 브라우저에서 실제 검산해 12/12 차단 ④ 무결성 대시보드 — 시민 무결성 지수 게이지 100/100, [감사 로그 조작] 토글 시 Replay-Verify가 어긋남(EVENT_ORDER_VIOLATION)을 잡아내며 지수가 60 WATCH로 하락 후 복구. 시연영상은 이 4막을 3분 내로 담는다(촬영 콘티: docs/submission/시연영상-촬영가이드.md).</w:t>
             </w:r>
           </w:p>
         </w:tc>
@@ -2308,7 +2294,7 @@
                 <w:color w:val="000000"/>
                 <w:sz w:val="20"/>
               </w:rPr>
-              <w:t>② 검증가능성 문화 — 보고서의 모든 수치(테스트 75, 12/12 차단, 242/110, CII 100/100, audit 0건)는 저장소의 명령어 한 줄로 재현된다. 주장과 코드의 불일치는 자체 하네스와 CI가 자동으로 잡아낸다.</w:t>
+              <w:t>② 검증가능성 문화 — 보고서의 모든 수치(테스트 86, 12/12 차단, 268/110, CII 100/100, audit 0건)는 저장소의 명령어 한 줄로 재현된다. 주장과 코드의 불일치는 자체 하네스와 CI가 자동으로 잡아낸다.</w:t>
             </w:r>
           </w:p>
           <w:p>
@@ -6826,7 +6812,7 @@
                 <w:color w:val="000000"/>
                 <w:sz w:val="20"/>
               </w:rPr>
-              <w:t>코드 작성·리팩터링·디버깅 보조용으로 Anthropic Claude Code를 활용함. AI 보조로 작성된 코드는 전량 자동 테스트 75개, 레드팀 공격 코퍼스 12종, CI 8단계 게이트로 검증했으며, 핵심 동작 원리(널리파이어 격리, RFC8785 서명, 리플레이 상태루트, cii-v1 공식)는 docs/architecture.md에 직접 기술하여 이해도를 증빙한다. 출품작 자체에 탑재된 AI 모델은 없다.</w:t>
+              <w:t>코드 작성·리팩터링·디버깅 보조용으로 Anthropic Claude Code를 활용함. AI 보조로 작성된 코드는 전량 자동 테스트 86개, 레드팀 공격 코퍼스 12종, CI 8단계 게이트로 검증했으며, 핵심 동작 원리(널리파이어 격리, RFC8785 서명, 리플레이 상태루트, cii-v1 공식)는 docs/architecture.md에 직접 기술하여 이해도를 증빙한다. 출품작 자체에 탑재된 AI 모델은 없다.</w:t>
             </w:r>
           </w:p>
         </w:tc>

</xml_diff>